<commit_message>
docs: match report style to the earlier DBMS report
Emblem on the title page, underlined subheadings, project title on
the cover and a comparison table in the literature review.

Co-Authored-By: Claude Sonnet 5.5 <noreply@anthropic.com>
</commit_message>
<xml_diff>
--- a/report/ThreadSense_IA3_Report.docx
+++ b/report/ThreadSense_IA3_Report.docx
@@ -114,7 +114,23 @@
     </w:p>
     <w:p>
       <w:pPr>
-        <w:spacing w:after="700"/>
+        <w:spacing w:after="160"/>
+        <w:jc w:val="center"/>
+      </w:pPr>
+      <w:r>
+        <w:rPr>
+          <w:rFonts w:ascii="Times New Roman" w:cs="Times New Roman" w:eastAsia="Times New Roman" w:hAnsi="Times New Roman"/>
+          <w:b/>
+          <w:bCs/>
+          <w:sz w:val="24"/>
+          <w:szCs w:val="24"/>
+        </w:rPr>
+        <w:t xml:space="preserve">ThreadSense: Discovering Which Reddit Communities You Belong In</w:t>
+      </w:r>
+    </w:p>
+    <w:p>
+      <w:pPr>
+        <w:spacing w:after="600"/>
       </w:pPr>
     </w:p>
     <w:p>
@@ -506,9 +522,9 @@
       <w:r>
         <w:drawing>
           <wp:inline distT="0" distB="0" distL="0" distR="0">
-            <wp:extent cx="4191000" cy="704850"/>
+            <wp:extent cx="1047750" cy="990600"/>
             <wp:effectExtent t="0" r="0" b="0" l="0"/>
-            <wp:docPr id="1" name="report/assets/karunya_logo.png" descr="report/assets/karunya_logo.png" title="report/assets/karunya_logo.png"/>
+            <wp:docPr id="1" name="report/assets/karunya_emblem.png" descr="report/assets/karunya_emblem.png" title="report/assets/karunya_emblem.png"/>
             <wp:cNvGraphicFramePr>
               <a:graphicFrameLocks xmlns:a="http://schemas.openxmlformats.org/drawingml/2006/main" noChangeAspect="1"/>
             </wp:cNvGraphicFramePr>
@@ -522,7 +538,7 @@
                     </pic:cNvPicPr>
                   </pic:nvPicPr>
                   <pic:blipFill>
-                    <a:blip r:embed="rId8" cstate="none"/>
+                    <a:blip r:embed="rId12" cstate="none"/>
                     <a:srcRect/>
                     <a:stretch>
                       <a:fillRect/>
@@ -531,7 +547,7 @@
                   <pic:spPr bwMode="auto">
                     <a:xfrm>
                       <a:off x="0" y="0"/>
-                      <a:ext cx="4191000" cy="704850"/>
+                      <a:ext cx="1047750" cy="990600"/>
                     </a:xfrm>
                     <a:prstGeom prst="rect">
                       <a:avLst/>
@@ -727,6 +743,7 @@
           <w:bCs/>
           <w:sz w:val="24"/>
           <w:szCs w:val="24"/>
+          <w:u w:val="single"/>
         </w:rPr>
         <w:t xml:space="preserve">1.1 Problem Statement</w:t>
       </w:r>
@@ -757,6 +774,7 @@
           <w:bCs/>
           <w:sz w:val="24"/>
           <w:szCs w:val="24"/>
+          <w:u w:val="single"/>
         </w:rPr>
         <w:t xml:space="preserve">1.2 Objectives</w:t>
       </w:r>
@@ -849,6 +867,7 @@
           <w:bCs/>
           <w:sz w:val="24"/>
           <w:szCs w:val="24"/>
+          <w:u w:val="single"/>
         </w:rPr>
         <w:t xml:space="preserve">1.3 Dataset</w:t>
       </w:r>
@@ -879,6 +898,7 @@
           <w:bCs/>
           <w:sz w:val="24"/>
           <w:szCs w:val="24"/>
+          <w:u w:val="single"/>
         </w:rPr>
         <w:t xml:space="preserve">1.4 Limits</w:t>
       </w:r>
@@ -974,6 +994,721 @@
     </w:p>
     <w:p>
       <w:pPr>
+        <w:keepNext/>
+        <w:spacing w:after="120" w:before="200"/>
+      </w:pPr>
+      <w:r>
+        <w:rPr>
+          <w:rFonts w:ascii="Times New Roman" w:cs="Times New Roman" w:eastAsia="Times New Roman" w:hAnsi="Times New Roman"/>
+          <w:b/>
+          <w:bCs/>
+          <w:sz w:val="24"/>
+          <w:szCs w:val="24"/>
+          <w:u w:val="single"/>
+        </w:rPr>
+        <w:t xml:space="preserve">Comparison with Other Approaches</w:t>
+      </w:r>
+    </w:p>
+    <w:tbl>
+      <w:tblPr>
+        <w:tblW w:type="dxa" w:w="9026"/>
+        <w:tblBorders>
+          <w:top w:val="single" w:color="auto" w:sz="4"/>
+          <w:left w:val="single" w:color="auto" w:sz="4"/>
+          <w:bottom w:val="single" w:color="auto" w:sz="4"/>
+          <w:right w:val="single" w:color="auto" w:sz="4"/>
+          <w:insideH w:val="single" w:color="auto" w:sz="4"/>
+          <w:insideV w:val="single" w:color="auto" w:sz="4"/>
+        </w:tblBorders>
+      </w:tblPr>
+      <w:tblGrid>
+        <w:gridCol w:w="2500"/>
+        <w:gridCol w:w="1900"/>
+        <w:gridCol w:w="2300"/>
+        <w:gridCol w:w="2326"/>
+      </w:tblGrid>
+      <w:tr>
+        <w:trPr>
+          <w:cantSplit/>
+          <w:tblHeader/>
+        </w:trPr>
+        <w:tc>
+          <w:tcPr>
+            <w:tcW w:type="dxa" w:w="2500"/>
+            <w:tcBorders>
+              <w:top w:val="single" w:color="000000" w:sz="4"/>
+              <w:left w:val="single" w:color="000000" w:sz="4"/>
+              <w:bottom w:val="single" w:color="000000" w:sz="4"/>
+              <w:right w:val="single" w:color="000000" w:sz="4"/>
+            </w:tcBorders>
+            <w:shd w:fill="E7E6E6" w:color="auto" w:val="clear"/>
+            <w:tcMar>
+              <w:top w:type="dxa" w:w="60"/>
+              <w:left w:type="dxa" w:w="100"/>
+              <w:bottom w:type="dxa" w:w="60"/>
+              <w:right w:type="dxa" w:w="100"/>
+            </w:tcMar>
+          </w:tcPr>
+          <w:p>
+            <w:pPr>
+              <w:spacing w:after="0"/>
+            </w:pPr>
+            <w:r>
+              <w:rPr>
+                <w:rFonts w:ascii="Times New Roman" w:cs="Times New Roman" w:eastAsia="Times New Roman" w:hAnsi="Times New Roman"/>
+                <w:b/>
+                <w:bCs/>
+                <w:sz w:val="22"/>
+                <w:szCs w:val="22"/>
+              </w:rPr>
+              <w:t xml:space="preserve">Feature</w:t>
+            </w:r>
+          </w:p>
+        </w:tc>
+        <w:tc>
+          <w:tcPr>
+            <w:tcW w:type="dxa" w:w="1900"/>
+            <w:tcBorders>
+              <w:top w:val="single" w:color="000000" w:sz="4"/>
+              <w:left w:val="single" w:color="000000" w:sz="4"/>
+              <w:bottom w:val="single" w:color="000000" w:sz="4"/>
+              <w:right w:val="single" w:color="000000" w:sz="4"/>
+            </w:tcBorders>
+            <w:shd w:fill="E7E6E6" w:color="auto" w:val="clear"/>
+            <w:tcMar>
+              <w:top w:type="dxa" w:w="60"/>
+              <w:left w:type="dxa" w:w="100"/>
+              <w:bottom w:type="dxa" w:w="60"/>
+              <w:right w:type="dxa" w:w="100"/>
+            </w:tcMar>
+          </w:tcPr>
+          <w:p>
+            <w:pPr>
+              <w:spacing w:after="0"/>
+            </w:pPr>
+            <w:r>
+              <w:rPr>
+                <w:rFonts w:ascii="Times New Roman" w:cs="Times New Roman" w:eastAsia="Times New Roman" w:hAnsi="Times New Roman"/>
+                <w:b/>
+                <w:bCs/>
+                <w:sz w:val="22"/>
+                <w:szCs w:val="22"/>
+              </w:rPr>
+              <w:t xml:space="preserve">Keyword search</w:t>
+            </w:r>
+          </w:p>
+        </w:tc>
+        <w:tc>
+          <w:tcPr>
+            <w:tcW w:type="dxa" w:w="2300"/>
+            <w:tcBorders>
+              <w:top w:val="single" w:color="000000" w:sz="4"/>
+              <w:left w:val="single" w:color="000000" w:sz="4"/>
+              <w:bottom w:val="single" w:color="000000" w:sz="4"/>
+              <w:right w:val="single" w:color="000000" w:sz="4"/>
+            </w:tcBorders>
+            <w:shd w:fill="E7E6E6" w:color="auto" w:val="clear"/>
+            <w:tcMar>
+              <w:top w:type="dxa" w:w="60"/>
+              <w:left w:type="dxa" w:w="100"/>
+              <w:bottom w:type="dxa" w:w="60"/>
+              <w:right w:type="dxa" w:w="100"/>
+            </w:tcMar>
+          </w:tcPr>
+          <w:p>
+            <w:pPr>
+              <w:spacing w:after="0"/>
+            </w:pPr>
+            <w:r>
+              <w:rPr>
+                <w:rFonts w:ascii="Times New Roman" w:cs="Times New Roman" w:eastAsia="Times New Roman" w:hAnsi="Times New Roman"/>
+                <w:b/>
+                <w:bCs/>
+                <w:sz w:val="22"/>
+                <w:szCs w:val="22"/>
+              </w:rPr>
+              <w:t xml:space="preserve">Collaborative filtering</w:t>
+            </w:r>
+          </w:p>
+        </w:tc>
+        <w:tc>
+          <w:tcPr>
+            <w:tcW w:type="dxa" w:w="2326"/>
+            <w:tcBorders>
+              <w:top w:val="single" w:color="000000" w:sz="4"/>
+              <w:left w:val="single" w:color="000000" w:sz="4"/>
+              <w:bottom w:val="single" w:color="000000" w:sz="4"/>
+              <w:right w:val="single" w:color="000000" w:sz="4"/>
+            </w:tcBorders>
+            <w:shd w:fill="E7E6E6" w:color="auto" w:val="clear"/>
+            <w:tcMar>
+              <w:top w:type="dxa" w:w="60"/>
+              <w:left w:type="dxa" w:w="100"/>
+              <w:bottom w:type="dxa" w:w="60"/>
+              <w:right w:type="dxa" w:w="100"/>
+            </w:tcMar>
+          </w:tcPr>
+          <w:p>
+            <w:pPr>
+              <w:spacing w:after="0"/>
+            </w:pPr>
+            <w:r>
+              <w:rPr>
+                <w:rFonts w:ascii="Times New Roman" w:cs="Times New Roman" w:eastAsia="Times New Roman" w:hAnsi="Times New Roman"/>
+                <w:b/>
+                <w:bCs/>
+                <w:sz w:val="22"/>
+                <w:szCs w:val="22"/>
+              </w:rPr>
+              <w:t xml:space="preserve">ThreadSense</w:t>
+            </w:r>
+          </w:p>
+        </w:tc>
+      </w:tr>
+      <w:tr>
+        <w:trPr>
+          <w:cantSplit/>
+          <w:tblHeader w:val="false"/>
+        </w:trPr>
+        <w:tc>
+          <w:tcPr>
+            <w:tcW w:type="dxa" w:w="2500"/>
+            <w:tcBorders>
+              <w:top w:val="single" w:color="000000" w:sz="4"/>
+              <w:left w:val="single" w:color="000000" w:sz="4"/>
+              <w:bottom w:val="single" w:color="000000" w:sz="4"/>
+              <w:right w:val="single" w:color="000000" w:sz="4"/>
+            </w:tcBorders>
+            <w:tcMar>
+              <w:top w:type="dxa" w:w="60"/>
+              <w:left w:type="dxa" w:w="100"/>
+              <w:bottom w:type="dxa" w:w="60"/>
+              <w:right w:type="dxa" w:w="100"/>
+            </w:tcMar>
+          </w:tcPr>
+          <w:p>
+            <w:pPr>
+              <w:spacing w:after="0"/>
+            </w:pPr>
+            <w:r>
+              <w:rPr>
+                <w:rFonts w:ascii="Times New Roman" w:cs="Times New Roman" w:eastAsia="Times New Roman" w:hAnsi="Times New Roman"/>
+                <w:b w:val="false"/>
+                <w:bCs w:val="false"/>
+                <w:sz w:val="22"/>
+                <w:szCs w:val="22"/>
+              </w:rPr>
+              <w:t xml:space="preserve">Needs user history</w:t>
+            </w:r>
+          </w:p>
+        </w:tc>
+        <w:tc>
+          <w:tcPr>
+            <w:tcW w:type="dxa" w:w="1900"/>
+            <w:tcBorders>
+              <w:top w:val="single" w:color="000000" w:sz="4"/>
+              <w:left w:val="single" w:color="000000" w:sz="4"/>
+              <w:bottom w:val="single" w:color="000000" w:sz="4"/>
+              <w:right w:val="single" w:color="000000" w:sz="4"/>
+            </w:tcBorders>
+            <w:tcMar>
+              <w:top w:type="dxa" w:w="60"/>
+              <w:left w:type="dxa" w:w="100"/>
+              <w:bottom w:type="dxa" w:w="60"/>
+              <w:right w:type="dxa" w:w="100"/>
+            </w:tcMar>
+          </w:tcPr>
+          <w:p>
+            <w:pPr>
+              <w:spacing w:after="0"/>
+            </w:pPr>
+            <w:r>
+              <w:rPr>
+                <w:rFonts w:ascii="Times New Roman" w:cs="Times New Roman" w:eastAsia="Times New Roman" w:hAnsi="Times New Roman"/>
+                <w:b w:val="false"/>
+                <w:bCs w:val="false"/>
+                <w:sz w:val="22"/>
+                <w:szCs w:val="22"/>
+              </w:rPr>
+              <w:t xml:space="preserve">No</w:t>
+            </w:r>
+          </w:p>
+        </w:tc>
+        <w:tc>
+          <w:tcPr>
+            <w:tcW w:type="dxa" w:w="2300"/>
+            <w:tcBorders>
+              <w:top w:val="single" w:color="000000" w:sz="4"/>
+              <w:left w:val="single" w:color="000000" w:sz="4"/>
+              <w:bottom w:val="single" w:color="000000" w:sz="4"/>
+              <w:right w:val="single" w:color="000000" w:sz="4"/>
+            </w:tcBorders>
+            <w:tcMar>
+              <w:top w:type="dxa" w:w="60"/>
+              <w:left w:type="dxa" w:w="100"/>
+              <w:bottom w:type="dxa" w:w="60"/>
+              <w:right w:type="dxa" w:w="100"/>
+            </w:tcMar>
+          </w:tcPr>
+          <w:p>
+            <w:pPr>
+              <w:spacing w:after="0"/>
+            </w:pPr>
+            <w:r>
+              <w:rPr>
+                <w:rFonts w:ascii="Times New Roman" w:cs="Times New Roman" w:eastAsia="Times New Roman" w:hAnsi="Times New Roman"/>
+                <w:b w:val="false"/>
+                <w:bCs w:val="false"/>
+                <w:sz w:val="22"/>
+                <w:szCs w:val="22"/>
+              </w:rPr>
+              <w:t xml:space="preserve">Yes</w:t>
+            </w:r>
+          </w:p>
+        </w:tc>
+        <w:tc>
+          <w:tcPr>
+            <w:tcW w:type="dxa" w:w="2326"/>
+            <w:tcBorders>
+              <w:top w:val="single" w:color="000000" w:sz="4"/>
+              <w:left w:val="single" w:color="000000" w:sz="4"/>
+              <w:bottom w:val="single" w:color="000000" w:sz="4"/>
+              <w:right w:val="single" w:color="000000" w:sz="4"/>
+            </w:tcBorders>
+            <w:tcMar>
+              <w:top w:type="dxa" w:w="60"/>
+              <w:left w:type="dxa" w:w="100"/>
+              <w:bottom w:type="dxa" w:w="60"/>
+              <w:right w:type="dxa" w:w="100"/>
+            </w:tcMar>
+          </w:tcPr>
+          <w:p>
+            <w:pPr>
+              <w:spacing w:after="0"/>
+            </w:pPr>
+            <w:r>
+              <w:rPr>
+                <w:rFonts w:ascii="Times New Roman" w:cs="Times New Roman" w:eastAsia="Times New Roman" w:hAnsi="Times New Roman"/>
+                <w:b w:val="false"/>
+                <w:bCs w:val="false"/>
+                <w:sz w:val="22"/>
+                <w:szCs w:val="22"/>
+              </w:rPr>
+              <w:t xml:space="preserve">No</w:t>
+            </w:r>
+          </w:p>
+        </w:tc>
+      </w:tr>
+      <w:tr>
+        <w:trPr>
+          <w:cantSplit/>
+          <w:tblHeader w:val="false"/>
+        </w:trPr>
+        <w:tc>
+          <w:tcPr>
+            <w:tcW w:type="dxa" w:w="2500"/>
+            <w:tcBorders>
+              <w:top w:val="single" w:color="000000" w:sz="4"/>
+              <w:left w:val="single" w:color="000000" w:sz="4"/>
+              <w:bottom w:val="single" w:color="000000" w:sz="4"/>
+              <w:right w:val="single" w:color="000000" w:sz="4"/>
+            </w:tcBorders>
+            <w:tcMar>
+              <w:top w:type="dxa" w:w="60"/>
+              <w:left w:type="dxa" w:w="100"/>
+              <w:bottom w:type="dxa" w:w="60"/>
+              <w:right w:type="dxa" w:w="100"/>
+            </w:tcMar>
+          </w:tcPr>
+          <w:p>
+            <w:pPr>
+              <w:spacing w:after="0"/>
+            </w:pPr>
+            <w:r>
+              <w:rPr>
+                <w:rFonts w:ascii="Times New Roman" w:cs="Times New Roman" w:eastAsia="Times New Roman" w:hAnsi="Times New Roman"/>
+                <w:b w:val="false"/>
+                <w:bCs w:val="false"/>
+                <w:sz w:val="22"/>
+                <w:szCs w:val="22"/>
+              </w:rPr>
+              <w:t xml:space="preserve">Uses the words of a post</w:t>
+            </w:r>
+          </w:p>
+        </w:tc>
+        <w:tc>
+          <w:tcPr>
+            <w:tcW w:type="dxa" w:w="1900"/>
+            <w:tcBorders>
+              <w:top w:val="single" w:color="000000" w:sz="4"/>
+              <w:left w:val="single" w:color="000000" w:sz="4"/>
+              <w:bottom w:val="single" w:color="000000" w:sz="4"/>
+              <w:right w:val="single" w:color="000000" w:sz="4"/>
+            </w:tcBorders>
+            <w:tcMar>
+              <w:top w:type="dxa" w:w="60"/>
+              <w:left w:type="dxa" w:w="100"/>
+              <w:bottom w:type="dxa" w:w="60"/>
+              <w:right w:type="dxa" w:w="100"/>
+            </w:tcMar>
+          </w:tcPr>
+          <w:p>
+            <w:pPr>
+              <w:spacing w:after="0"/>
+            </w:pPr>
+            <w:r>
+              <w:rPr>
+                <w:rFonts w:ascii="Times New Roman" w:cs="Times New Roman" w:eastAsia="Times New Roman" w:hAnsi="Times New Roman"/>
+                <w:b w:val="false"/>
+                <w:bCs w:val="false"/>
+                <w:sz w:val="22"/>
+                <w:szCs w:val="22"/>
+              </w:rPr>
+              <w:t xml:space="preserve">Partly</w:t>
+            </w:r>
+          </w:p>
+        </w:tc>
+        <w:tc>
+          <w:tcPr>
+            <w:tcW w:type="dxa" w:w="2300"/>
+            <w:tcBorders>
+              <w:top w:val="single" w:color="000000" w:sz="4"/>
+              <w:left w:val="single" w:color="000000" w:sz="4"/>
+              <w:bottom w:val="single" w:color="000000" w:sz="4"/>
+              <w:right w:val="single" w:color="000000" w:sz="4"/>
+            </w:tcBorders>
+            <w:tcMar>
+              <w:top w:type="dxa" w:w="60"/>
+              <w:left w:type="dxa" w:w="100"/>
+              <w:bottom w:type="dxa" w:w="60"/>
+              <w:right w:type="dxa" w:w="100"/>
+            </w:tcMar>
+          </w:tcPr>
+          <w:p>
+            <w:pPr>
+              <w:spacing w:after="0"/>
+            </w:pPr>
+            <w:r>
+              <w:rPr>
+                <w:rFonts w:ascii="Times New Roman" w:cs="Times New Roman" w:eastAsia="Times New Roman" w:hAnsi="Times New Roman"/>
+                <w:b w:val="false"/>
+                <w:bCs w:val="false"/>
+                <w:sz w:val="22"/>
+                <w:szCs w:val="22"/>
+              </w:rPr>
+              <w:t xml:space="preserve">No</w:t>
+            </w:r>
+          </w:p>
+        </w:tc>
+        <w:tc>
+          <w:tcPr>
+            <w:tcW w:type="dxa" w:w="2326"/>
+            <w:tcBorders>
+              <w:top w:val="single" w:color="000000" w:sz="4"/>
+              <w:left w:val="single" w:color="000000" w:sz="4"/>
+              <w:bottom w:val="single" w:color="000000" w:sz="4"/>
+              <w:right w:val="single" w:color="000000" w:sz="4"/>
+            </w:tcBorders>
+            <w:tcMar>
+              <w:top w:type="dxa" w:w="60"/>
+              <w:left w:type="dxa" w:w="100"/>
+              <w:bottom w:type="dxa" w:w="60"/>
+              <w:right w:type="dxa" w:w="100"/>
+            </w:tcMar>
+          </w:tcPr>
+          <w:p>
+            <w:pPr>
+              <w:spacing w:after="0"/>
+            </w:pPr>
+            <w:r>
+              <w:rPr>
+                <w:rFonts w:ascii="Times New Roman" w:cs="Times New Roman" w:eastAsia="Times New Roman" w:hAnsi="Times New Roman"/>
+                <w:b w:val="false"/>
+                <w:bCs w:val="false"/>
+                <w:sz w:val="22"/>
+                <w:szCs w:val="22"/>
+              </w:rPr>
+              <w:t xml:space="preserve">Yes</w:t>
+            </w:r>
+          </w:p>
+        </w:tc>
+      </w:tr>
+      <w:tr>
+        <w:trPr>
+          <w:cantSplit/>
+          <w:tblHeader w:val="false"/>
+        </w:trPr>
+        <w:tc>
+          <w:tcPr>
+            <w:tcW w:type="dxa" w:w="2500"/>
+            <w:tcBorders>
+              <w:top w:val="single" w:color="000000" w:sz="4"/>
+              <w:left w:val="single" w:color="000000" w:sz="4"/>
+              <w:bottom w:val="single" w:color="000000" w:sz="4"/>
+              <w:right w:val="single" w:color="000000" w:sz="4"/>
+            </w:tcBorders>
+            <w:tcMar>
+              <w:top w:type="dxa" w:w="60"/>
+              <w:left w:type="dxa" w:w="100"/>
+              <w:bottom w:type="dxa" w:w="60"/>
+              <w:right w:type="dxa" w:w="100"/>
+            </w:tcMar>
+          </w:tcPr>
+          <w:p>
+            <w:pPr>
+              <w:spacing w:after="0"/>
+            </w:pPr>
+            <w:r>
+              <w:rPr>
+                <w:rFonts w:ascii="Times New Roman" w:cs="Times New Roman" w:eastAsia="Times New Roman" w:hAnsi="Times New Roman"/>
+                <w:b w:val="false"/>
+                <w:bCs w:val="false"/>
+                <w:sz w:val="22"/>
+                <w:szCs w:val="22"/>
+              </w:rPr>
+              <w:t xml:space="preserve">Suggests a community</w:t>
+            </w:r>
+          </w:p>
+        </w:tc>
+        <w:tc>
+          <w:tcPr>
+            <w:tcW w:type="dxa" w:w="1900"/>
+            <w:tcBorders>
+              <w:top w:val="single" w:color="000000" w:sz="4"/>
+              <w:left w:val="single" w:color="000000" w:sz="4"/>
+              <w:bottom w:val="single" w:color="000000" w:sz="4"/>
+              <w:right w:val="single" w:color="000000" w:sz="4"/>
+            </w:tcBorders>
+            <w:tcMar>
+              <w:top w:type="dxa" w:w="60"/>
+              <w:left w:type="dxa" w:w="100"/>
+              <w:bottom w:type="dxa" w:w="60"/>
+              <w:right w:type="dxa" w:w="100"/>
+            </w:tcMar>
+          </w:tcPr>
+          <w:p>
+            <w:pPr>
+              <w:spacing w:after="0"/>
+            </w:pPr>
+            <w:r>
+              <w:rPr>
+                <w:rFonts w:ascii="Times New Roman" w:cs="Times New Roman" w:eastAsia="Times New Roman" w:hAnsi="Times New Roman"/>
+                <w:b w:val="false"/>
+                <w:bCs w:val="false"/>
+                <w:sz w:val="22"/>
+                <w:szCs w:val="22"/>
+              </w:rPr>
+              <w:t xml:space="preserve">No</w:t>
+            </w:r>
+          </w:p>
+        </w:tc>
+        <w:tc>
+          <w:tcPr>
+            <w:tcW w:type="dxa" w:w="2300"/>
+            <w:tcBorders>
+              <w:top w:val="single" w:color="000000" w:sz="4"/>
+              <w:left w:val="single" w:color="000000" w:sz="4"/>
+              <w:bottom w:val="single" w:color="000000" w:sz="4"/>
+              <w:right w:val="single" w:color="000000" w:sz="4"/>
+            </w:tcBorders>
+            <w:tcMar>
+              <w:top w:type="dxa" w:w="60"/>
+              <w:left w:type="dxa" w:w="100"/>
+              <w:bottom w:type="dxa" w:w="60"/>
+              <w:right w:type="dxa" w:w="100"/>
+            </w:tcMar>
+          </w:tcPr>
+          <w:p>
+            <w:pPr>
+              <w:spacing w:after="0"/>
+            </w:pPr>
+            <w:r>
+              <w:rPr>
+                <w:rFonts w:ascii="Times New Roman" w:cs="Times New Roman" w:eastAsia="Times New Roman" w:hAnsi="Times New Roman"/>
+                <w:b w:val="false"/>
+                <w:bCs w:val="false"/>
+                <w:sz w:val="22"/>
+                <w:szCs w:val="22"/>
+              </w:rPr>
+              <w:t xml:space="preserve">Yes</w:t>
+            </w:r>
+          </w:p>
+        </w:tc>
+        <w:tc>
+          <w:tcPr>
+            <w:tcW w:type="dxa" w:w="2326"/>
+            <w:tcBorders>
+              <w:top w:val="single" w:color="000000" w:sz="4"/>
+              <w:left w:val="single" w:color="000000" w:sz="4"/>
+              <w:bottom w:val="single" w:color="000000" w:sz="4"/>
+              <w:right w:val="single" w:color="000000" w:sz="4"/>
+            </w:tcBorders>
+            <w:tcMar>
+              <w:top w:type="dxa" w:w="60"/>
+              <w:left w:type="dxa" w:w="100"/>
+              <w:bottom w:type="dxa" w:w="60"/>
+              <w:right w:type="dxa" w:w="100"/>
+            </w:tcMar>
+          </w:tcPr>
+          <w:p>
+            <w:pPr>
+              <w:spacing w:after="0"/>
+            </w:pPr>
+            <w:r>
+              <w:rPr>
+                <w:rFonts w:ascii="Times New Roman" w:cs="Times New Roman" w:eastAsia="Times New Roman" w:hAnsi="Times New Roman"/>
+                <w:b w:val="false"/>
+                <w:bCs w:val="false"/>
+                <w:sz w:val="22"/>
+                <w:szCs w:val="22"/>
+              </w:rPr>
+              <w:t xml:space="preserve">Yes</w:t>
+            </w:r>
+          </w:p>
+        </w:tc>
+      </w:tr>
+      <w:tr>
+        <w:trPr>
+          <w:cantSplit/>
+          <w:tblHeader w:val="false"/>
+        </w:trPr>
+        <w:tc>
+          <w:tcPr>
+            <w:tcW w:type="dxa" w:w="2500"/>
+            <w:tcBorders>
+              <w:top w:val="single" w:color="000000" w:sz="4"/>
+              <w:left w:val="single" w:color="000000" w:sz="4"/>
+              <w:bottom w:val="single" w:color="000000" w:sz="4"/>
+              <w:right w:val="single" w:color="000000" w:sz="4"/>
+            </w:tcBorders>
+            <w:tcMar>
+              <w:top w:type="dxa" w:w="60"/>
+              <w:left w:type="dxa" w:w="100"/>
+              <w:bottom w:type="dxa" w:w="60"/>
+              <w:right w:type="dxa" w:w="100"/>
+            </w:tcMar>
+          </w:tcPr>
+          <w:p>
+            <w:pPr>
+              <w:spacing w:after="0"/>
+            </w:pPr>
+            <w:r>
+              <w:rPr>
+                <w:rFonts w:ascii="Times New Roman" w:cs="Times New Roman" w:eastAsia="Times New Roman" w:hAnsi="Times New Roman"/>
+                <w:b w:val="false"/>
+                <w:bCs w:val="false"/>
+                <w:sz w:val="22"/>
+                <w:szCs w:val="22"/>
+              </w:rPr>
+              <w:t xml:space="preserve">Explains its choice</w:t>
+            </w:r>
+          </w:p>
+        </w:tc>
+        <w:tc>
+          <w:tcPr>
+            <w:tcW w:type="dxa" w:w="1900"/>
+            <w:tcBorders>
+              <w:top w:val="single" w:color="000000" w:sz="4"/>
+              <w:left w:val="single" w:color="000000" w:sz="4"/>
+              <w:bottom w:val="single" w:color="000000" w:sz="4"/>
+              <w:right w:val="single" w:color="000000" w:sz="4"/>
+            </w:tcBorders>
+            <w:tcMar>
+              <w:top w:type="dxa" w:w="60"/>
+              <w:left w:type="dxa" w:w="100"/>
+              <w:bottom w:type="dxa" w:w="60"/>
+              <w:right w:type="dxa" w:w="100"/>
+            </w:tcMar>
+          </w:tcPr>
+          <w:p>
+            <w:pPr>
+              <w:spacing w:after="0"/>
+            </w:pPr>
+            <w:r>
+              <w:rPr>
+                <w:rFonts w:ascii="Times New Roman" w:cs="Times New Roman" w:eastAsia="Times New Roman" w:hAnsi="Times New Roman"/>
+                <w:b w:val="false"/>
+                <w:bCs w:val="false"/>
+                <w:sz w:val="22"/>
+                <w:szCs w:val="22"/>
+              </w:rPr>
+              <w:t xml:space="preserve">No</w:t>
+            </w:r>
+          </w:p>
+        </w:tc>
+        <w:tc>
+          <w:tcPr>
+            <w:tcW w:type="dxa" w:w="2300"/>
+            <w:tcBorders>
+              <w:top w:val="single" w:color="000000" w:sz="4"/>
+              <w:left w:val="single" w:color="000000" w:sz="4"/>
+              <w:bottom w:val="single" w:color="000000" w:sz="4"/>
+              <w:right w:val="single" w:color="000000" w:sz="4"/>
+            </w:tcBorders>
+            <w:tcMar>
+              <w:top w:type="dxa" w:w="60"/>
+              <w:left w:type="dxa" w:w="100"/>
+              <w:bottom w:type="dxa" w:w="60"/>
+              <w:right w:type="dxa" w:w="100"/>
+            </w:tcMar>
+          </w:tcPr>
+          <w:p>
+            <w:pPr>
+              <w:spacing w:after="0"/>
+            </w:pPr>
+            <w:r>
+              <w:rPr>
+                <w:rFonts w:ascii="Times New Roman" w:cs="Times New Roman" w:eastAsia="Times New Roman" w:hAnsi="Times New Roman"/>
+                <w:b w:val="false"/>
+                <w:bCs w:val="false"/>
+                <w:sz w:val="22"/>
+                <w:szCs w:val="22"/>
+              </w:rPr>
+              <w:t xml:space="preserve">Rarely</w:t>
+            </w:r>
+          </w:p>
+        </w:tc>
+        <w:tc>
+          <w:tcPr>
+            <w:tcW w:type="dxa" w:w="2326"/>
+            <w:tcBorders>
+              <w:top w:val="single" w:color="000000" w:sz="4"/>
+              <w:left w:val="single" w:color="000000" w:sz="4"/>
+              <w:bottom w:val="single" w:color="000000" w:sz="4"/>
+              <w:right w:val="single" w:color="000000" w:sz="4"/>
+            </w:tcBorders>
+            <w:tcMar>
+              <w:top w:type="dxa" w:w="60"/>
+              <w:left w:type="dxa" w:w="100"/>
+              <w:bottom w:type="dxa" w:w="60"/>
+              <w:right w:type="dxa" w:w="100"/>
+            </w:tcMar>
+          </w:tcPr>
+          <w:p>
+            <w:pPr>
+              <w:spacing w:after="0"/>
+            </w:pPr>
+            <w:r>
+              <w:rPr>
+                <w:rFonts w:ascii="Times New Roman" w:cs="Times New Roman" w:eastAsia="Times New Roman" w:hAnsi="Times New Roman"/>
+                <w:b w:val="false"/>
+                <w:bCs w:val="false"/>
+                <w:sz w:val="22"/>
+                <w:szCs w:val="22"/>
+              </w:rPr>
+              <w:t xml:space="preserve">Yes, matched words</w:t>
+            </w:r>
+          </w:p>
+        </w:tc>
+      </w:tr>
+    </w:tbl>
+    <w:p>
+      <w:pPr>
+        <w:spacing w:after="200"/>
+      </w:pPr>
+    </w:p>
+    <w:p>
+      <w:pPr>
         <w:spacing w:after="200" w:line="312"/>
         <w:jc w:val="both"/>
       </w:pPr>
@@ -1045,6 +1780,7 @@
           <w:bCs/>
           <w:sz w:val="24"/>
           <w:szCs w:val="24"/>
+          <w:u w:val="single"/>
         </w:rPr>
         <w:t xml:space="preserve">3.1 Loading and Cleaning</w:t>
       </w:r>
@@ -1089,6 +1825,7 @@
           <w:bCs/>
           <w:sz w:val="24"/>
           <w:szCs w:val="24"/>
+          <w:u w:val="single"/>
         </w:rPr>
         <w:t xml:space="preserve">3.2 The Three MapReduce Jobs</w:t>
       </w:r>
@@ -1177,6 +1914,7 @@
           <w:bCs/>
           <w:sz w:val="24"/>
           <w:szCs w:val="24"/>
+          <w:u w:val="single"/>
         </w:rPr>
         <w:t xml:space="preserve">3.3 Recommending and Testing</w:t>
       </w:r>
@@ -1207,6 +1945,7 @@
           <w:bCs/>
           <w:sz w:val="24"/>
           <w:szCs w:val="24"/>
+          <w:u w:val="single"/>
         </w:rPr>
         <w:t xml:space="preserve">3.4 System Setup</w:t>
       </w:r>
@@ -1621,6 +2360,7 @@
           <w:bCs/>
           <w:sz w:val="24"/>
           <w:szCs w:val="24"/>
+          <w:u w:val="single"/>
         </w:rPr>
         <w:t xml:space="preserve">4.1 Problems We Faced</w:t>
       </w:r>
@@ -2907,6 +3647,7 @@
           <w:bCs/>
           <w:sz w:val="24"/>
           <w:szCs w:val="24"/>
+          <w:u w:val="single"/>
         </w:rPr>
         <w:t xml:space="preserve">6.1 How Well It Recommends</w:t>
       </w:r>
@@ -3268,7 +4009,7 @@
                     </pic:cNvPicPr>
                   </pic:nvPicPr>
                   <pic:blipFill>
-                    <a:blip r:embed="rId12" cstate="none"/>
+                    <a:blip r:embed="rId13" cstate="none"/>
                     <a:srcRect/>
                     <a:stretch>
                       <a:fillRect/>
@@ -3332,6 +4073,7 @@
           <w:bCs/>
           <w:sz w:val="24"/>
           <w:szCs w:val="24"/>
+          <w:u w:val="single"/>
         </w:rPr>
         <w:t xml:space="preserve">6.2 Examples</w:t>
       </w:r>
@@ -3666,6 +4408,7 @@
           <w:bCs/>
           <w:sz w:val="24"/>
           <w:szCs w:val="24"/>
+          <w:u w:val="single"/>
         </w:rPr>
         <w:t xml:space="preserve">6.3 Related Communities</w:t>
       </w:r>
@@ -3709,7 +4452,7 @@
                     </pic:cNvPicPr>
                   </pic:nvPicPr>
                   <pic:blipFill>
-                    <a:blip r:embed="rId13" cstate="none"/>
+                    <a:blip r:embed="rId14" cstate="none"/>
                     <a:srcRect/>
                     <a:stretch>
                       <a:fillRect/>
@@ -3759,6 +4502,7 @@
           <w:bCs/>
           <w:sz w:val="24"/>
           <w:szCs w:val="24"/>
+          <w:u w:val="single"/>
         </w:rPr>
         <w:t xml:space="preserve">6.4 mapReduce and Aggregation</w:t>
       </w:r>
@@ -4121,6 +4865,7 @@
           <w:bCs/>
           <w:sz w:val="24"/>
           <w:szCs w:val="24"/>
+          <w:u w:val="single"/>
         </w:rPr>
         <w:t xml:space="preserve">6.5 The Web Page</w:t>
       </w:r>
@@ -4150,7 +4895,7 @@
                     </pic:cNvPicPr>
                   </pic:nvPicPr>
                   <pic:blipFill>
-                    <a:blip r:embed="rId14" cstate="none"/>
+                    <a:blip r:embed="rId15" cstate="none"/>
                     <a:srcRect/>
                     <a:stretch>
                       <a:fillRect/>
@@ -4485,6 +5230,7 @@
           <w:bCs/>
           <w:sz w:val="24"/>
           <w:szCs w:val="24"/>
+          <w:u w:val="single"/>
         </w:rPr>
         <w:t xml:space="preserve">Appendix A: Technologies Used</w:t>
       </w:r>
@@ -4596,6 +5342,7 @@
           <w:bCs/>
           <w:sz w:val="24"/>
           <w:szCs w:val="24"/>
+          <w:u w:val="single"/>
         </w:rPr>
         <w:t xml:space="preserve">Appendix B: Job 2 Finalize Function</w:t>
       </w:r>
@@ -4774,6 +5521,7 @@
           <w:bCs/>
           <w:sz w:val="24"/>
           <w:szCs w:val="24"/>
+          <w:u w:val="single"/>
         </w:rPr>
         <w:t xml:space="preserve">Appendix C: Job 3 Map Function</w:t>
       </w:r>
@@ -4952,6 +5700,7 @@
           <w:bCs/>
           <w:sz w:val="24"/>
           <w:szCs w:val="24"/>
+          <w:u w:val="single"/>
         </w:rPr>
         <w:t xml:space="preserve">Appendix D: Sample Post</w:t>
       </w:r>
@@ -4982,6 +5731,7 @@
           <w:bCs/>
           <w:sz w:val="24"/>
           <w:szCs w:val="24"/>
+          <w:u w:val="single"/>
         </w:rPr>
         <w:t xml:space="preserve">Appendix E: How to Run</w:t>
       </w:r>

</xml_diff>